<commit_message>
Introduccion: el Proyecto Integrador es solo el trabajo escrito, sin prototipo, y se sube el informe sin .zip
Co-Authored-By: Claude Opus 5.5 <noreply@anthropic.com>
</commit_message>
<xml_diff>
--- a/Introduccion a la Ingenieria/Clases/Proyecto Integrador/Enunciado Proyecto Integrador - Introduccion a la Ingenieria.docx
+++ b/Introduccion a la Ingenieria/Clases/Proyecto Integrador/Enunciado Proyecto Integrador - Introduccion a la Ingenieria.docx
@@ -186,7 +186,7 @@
           <w:color w:val="2B2B2B"/>
           <w:sz w:val="22"/>
         </w:rPr>
-        <w:t>En este curso no se programa.</w:t>
+        <w:t>El proyecto es un trabajo escrito:</w:t>
       </w:r>
       <w:r>
         <w:rPr>
@@ -195,25 +195,7 @@
           <w:color w:val="2B2B2B"/>
           <w:sz w:val="22"/>
         </w:rPr>
-        <w:t xml:space="preserve"> La solución se diseña y se dibuja como </w:t>
-      </w:r>
-      <w:r>
-        <w:rPr>
-          <w:rFonts w:ascii="Calibri" w:hAnsi="Calibri" w:eastAsia="Calibri"/>
-          <w:b/>
-          <w:color w:val="2B2B2B"/>
-          <w:sz w:val="22"/>
-        </w:rPr>
-        <w:t>prototipo</w:t>
-      </w:r>
-      <w:r>
-        <w:rPr>
-          <w:rFonts w:ascii="Calibri" w:hAnsi="Calibri" w:eastAsia="Calibri"/>
-          <w:b w:val="0"/>
-          <w:color w:val="2B2B2B"/>
-          <w:sz w:val="22"/>
-        </w:rPr>
-        <w:t>: un dibujo que otra persona puede recorrer como si funcionara (en papel, Excalidraw, draw.io o Google Slides), que se prueba con una persona ajena al equipo. No hace falta saber programar ni instalar nada.</w:t>
+        <w:t xml:space="preserve"> el informe final. No se programa ni se construye nada: se estudia el problema, se comparan alternativas y se propone una solución, explicada por escrito.</w:t>
       </w:r>
     </w:p>
     <w:p>
@@ -259,7 +241,25 @@
           <w:color w:val="2B2B2B"/>
           <w:sz w:val="22"/>
         </w:rPr>
-        <w:t xml:space="preserve">Un solo archivo .zip con esta forma. La carpeta </w:t>
+        <w:t xml:space="preserve">Un solo archivo: el </w:t>
+      </w:r>
+      <w:r>
+        <w:rPr>
+          <w:rFonts w:ascii="Calibri" w:hAnsi="Calibri" w:eastAsia="Calibri"/>
+          <w:b/>
+          <w:color w:val="2B2B2B"/>
+          <w:sz w:val="22"/>
+        </w:rPr>
+        <w:t>informe final</w:t>
+      </w:r>
+      <w:r>
+        <w:rPr>
+          <w:rFonts w:ascii="Calibri" w:hAnsi="Calibri" w:eastAsia="Calibri"/>
+          <w:b w:val="0"/>
+          <w:color w:val="2B2B2B"/>
+          <w:sz w:val="22"/>
+        </w:rPr>
+        <w:t xml:space="preserve">, en .docx o .pdf. La plantilla está en la carpeta </w:t>
       </w:r>
       <w:r>
         <w:rPr>
@@ -277,219 +277,8 @@
           <w:color w:val="2B2B2B"/>
           <w:sz w:val="22"/>
         </w:rPr>
-        <w:t>, en esta misma carpeta, ya la trae armada: descárguenla, llénenla siguiendo sus INSTRUCCIONES y comprímanla.</w:t>
+        <w:t>, en esta misma carpeta: descárguenla y llénenla siguiendo sus INSTRUCCIONES.</w:t>
       </w:r>
-    </w:p>
-    <w:p>
-      <w:pPr>
-        <w:spacing w:after="0" w:before="0"/>
-        <w:shd w:val="clear" w:fill="F4F6F8"/>
-      </w:pPr>
-      <w:r>
-        <w:rPr>
-          <w:rFonts w:ascii="Consolas" w:hAnsi="Consolas" w:eastAsia="Consolas"/>
-          <w:b w:val="0"/>
-          <w:color w:val="2B2B2B"/>
-          <w:sz w:val="19"/>
-        </w:rPr>
-        <w:t xml:space="preserve">Equipo &lt;nombre&gt;.zip     </w:t>
-      </w:r>
-    </w:p>
-    <w:p>
-      <w:pPr>
-        <w:spacing w:after="0" w:before="0"/>
-        <w:shd w:val="clear" w:fill="F4F6F8"/>
-      </w:pPr>
-      <w:r>
-        <w:rPr>
-          <w:rFonts w:ascii="Consolas" w:hAnsi="Consolas" w:eastAsia="Consolas"/>
-          <w:b w:val="0"/>
-          <w:color w:val="2B2B2B"/>
-          <w:sz w:val="19"/>
-        </w:rPr>
-        <w:t>├── Informe final.docx  ← las 12 secciones de la plantilla</w:t>
-      </w:r>
-    </w:p>
-    <w:p>
-      <w:pPr>
-        <w:spacing w:after="0" w:before="0"/>
-        <w:shd w:val="clear" w:fill="F4F6F8"/>
-      </w:pPr>
-      <w:r>
-        <w:rPr>
-          <w:rFonts w:ascii="Consolas" w:hAnsi="Consolas" w:eastAsia="Consolas"/>
-          <w:b w:val="0"/>
-          <w:color w:val="2B2B2B"/>
-          <w:sz w:val="19"/>
-        </w:rPr>
-        <w:t xml:space="preserve">└── prototipo/          </w:t>
-      </w:r>
-    </w:p>
-    <w:p>
-      <w:pPr>
-        <w:spacing w:after="0" w:before="0"/>
-        <w:shd w:val="clear" w:fill="F4F6F8"/>
-      </w:pPr>
-      <w:r>
-        <w:rPr>
-          <w:rFonts w:ascii="Consolas" w:hAnsi="Consolas" w:eastAsia="Consolas"/>
-          <w:b w:val="0"/>
-          <w:color w:val="2B2B2B"/>
-          <w:sz w:val="19"/>
-        </w:rPr>
-        <w:t xml:space="preserve">    ├── v1.png          ← el prototipo de baja fidelidad</w:t>
-      </w:r>
-    </w:p>
-    <w:p>
-      <w:pPr>
-        <w:spacing w:after="0" w:before="0"/>
-        <w:shd w:val="clear" w:fill="F4F6F8"/>
-      </w:pPr>
-      <w:r>
-        <w:rPr>
-          <w:rFonts w:ascii="Consolas" w:hAnsi="Consolas" w:eastAsia="Consolas"/>
-          <w:b w:val="0"/>
-          <w:color w:val="2B2B2B"/>
-          <w:sz w:val="19"/>
-        </w:rPr>
-        <w:t xml:space="preserve">    └── v2.png          ← el prototipo mejorado</w:t>
-      </w:r>
-    </w:p>
-    <w:p>
-      <w:pPr>
-        <w:spacing w:after="80" w:before="0"/>
-        <w:jc w:val="left"/>
-      </w:pPr>
-    </w:p>
-    <w:tbl>
-      <w:tblPr>
-        <w:tblStyle w:val="TableGrid"/>
-        <w:tblW w:type="auto" w:w="0"/>
-        <w:tblLayout w:type="fixed"/>
-        <w:tblLook w:firstColumn="1" w:firstRow="1" w:lastColumn="0" w:lastRow="0" w:noHBand="0" w:noVBand="1" w:val="04A0"/>
-      </w:tblPr>
-      <w:tblGrid>
-        <w:gridCol w:w="4896"/>
-        <w:gridCol w:w="4896"/>
-      </w:tblGrid>
-      <w:tr>
-        <w:tc>
-          <w:tcPr>
-            <w:tcW w:type="dxa" w:w="2736"/>
-            <w:shd w:val="clear" w:fill="095292"/>
-          </w:tcPr>
-          <w:p>
-            <w:r/>
-            <w:r>
-              <w:rPr>
-                <w:rFonts w:ascii="Calibri" w:hAnsi="Calibri" w:eastAsia="Calibri"/>
-                <w:b/>
-                <w:color w:val="FFFFFF"/>
-                <w:sz w:val="20"/>
-              </w:rPr>
-              <w:t>Pieza</w:t>
-            </w:r>
-          </w:p>
-        </w:tc>
-        <w:tc>
-          <w:tcPr>
-            <w:tcW w:type="dxa" w:w="7056"/>
-            <w:shd w:val="clear" w:fill="095292"/>
-          </w:tcPr>
-          <w:p>
-            <w:r/>
-            <w:r>
-              <w:rPr>
-                <w:rFonts w:ascii="Calibri" w:hAnsi="Calibri" w:eastAsia="Calibri"/>
-                <w:b/>
-                <w:color w:val="FFFFFF"/>
-                <w:sz w:val="20"/>
-              </w:rPr>
-              <w:t>Qué tiene que tener</w:t>
-            </w:r>
-          </w:p>
-        </w:tc>
-      </w:tr>
-      <w:tr>
-        <w:tc>
-          <w:tcPr>
-            <w:tcW w:type="dxa" w:w="2736"/>
-          </w:tcPr>
-          <w:p>
-            <w:r/>
-            <w:r>
-              <w:rPr>
-                <w:rFonts w:ascii="Calibri" w:hAnsi="Calibri" w:eastAsia="Calibri"/>
-                <w:b w:val="0"/>
-                <w:color w:val="2B2B2B"/>
-                <w:sz w:val="20"/>
-              </w:rPr>
-              <w:t>Informe final.docx</w:t>
-            </w:r>
-          </w:p>
-        </w:tc>
-        <w:tc>
-          <w:tcPr>
-            <w:tcW w:type="dxa" w:w="7056"/>
-          </w:tcPr>
-          <w:p>
-            <w:r/>
-            <w:r>
-              <w:rPr>
-                <w:rFonts w:ascii="Calibri" w:hAnsi="Calibri" w:eastAsia="Calibri"/>
-                <w:b w:val="0"/>
-                <w:color w:val="2B2B2B"/>
-                <w:sz w:val="20"/>
-              </w:rPr>
-              <w:t>Las 12 secciones de la plantilla, en 9 a 11 páginas. Se puede entregar en .docx o exportado a .pdf.</w:t>
-            </w:r>
-          </w:p>
-        </w:tc>
-      </w:tr>
-      <w:tr>
-        <w:tc>
-          <w:tcPr>
-            <w:tcW w:type="dxa" w:w="2736"/>
-            <w:shd w:val="clear" w:fill="F2F2F2"/>
-          </w:tcPr>
-          <w:p>
-            <w:r/>
-            <w:r>
-              <w:rPr>
-                <w:rFonts w:ascii="Calibri" w:hAnsi="Calibri" w:eastAsia="Calibri"/>
-                <w:b w:val="0"/>
-                <w:color w:val="2B2B2B"/>
-                <w:sz w:val="20"/>
-              </w:rPr>
-              <w:t>prototipo/</w:t>
-            </w:r>
-          </w:p>
-        </w:tc>
-        <w:tc>
-          <w:tcPr>
-            <w:tcW w:type="dxa" w:w="7056"/>
-            <w:shd w:val="clear" w:fill="F2F2F2"/>
-          </w:tcPr>
-          <w:p>
-            <w:r/>
-            <w:r>
-              <w:rPr>
-                <w:rFonts w:ascii="Calibri" w:hAnsi="Calibri" w:eastAsia="Calibri"/>
-                <w:b w:val="0"/>
-                <w:color w:val="2B2B2B"/>
-                <w:sz w:val="20"/>
-              </w:rPr>
-              <w:t>La v1 y la v2, en PNG o PDF. El enlace al prototipo navegable va en la sección 7 del informe.</w:t>
-            </w:r>
-          </w:p>
-        </w:tc>
-      </w:tr>
-    </w:tbl>
-    <w:p>
-      <w:pPr>
-        <w:spacing w:after="80" w:before="0"/>
-        <w:jc w:val="left"/>
-      </w:pPr>
     </w:p>
     <w:p>
       <w:pPr>
@@ -503,7 +292,7 @@
           <w:color w:val="269CCB"/>
           <w:sz w:val="22"/>
         </w:rPr>
-        <w:t>El informe final: el punto clave</w:t>
+        <w:t>Las 11 secciones del informe</w:t>
       </w:r>
     </w:p>
     <w:tbl>
@@ -932,7 +721,7 @@
                 <w:color w:val="2B2B2B"/>
                 <w:sz w:val="20"/>
               </w:rPr>
-              <w:t>La solución y el prototipo</w:t>
+              <w:t>La solución</w:t>
             </w:r>
           </w:p>
         </w:tc>
@@ -949,7 +738,7 @@
                 <w:color w:val="2B2B2B"/>
                 <w:sz w:val="20"/>
               </w:rPr>
-              <w:t>Descripción de la solución, capturas del prototipo v1 y v2, el enlace al prototipo navegable y el recorrido principal paso a paso.</w:t>
+              <w:t>Qué se propone y cómo funciona, sin programar: el recorrido de una persona que la usa, paso a paso, contado por escrito.</w:t>
             </w:r>
           </w:p>
         </w:tc>
@@ -987,7 +776,7 @@
                 <w:color w:val="2B2B2B"/>
                 <w:sz w:val="20"/>
               </w:rPr>
-              <w:t>Prueba y hallazgos</w:t>
+              <w:t>Impacto</w:t>
             </w:r>
           </w:p>
         </w:tc>
@@ -1005,7 +794,7 @@
                 <w:color w:val="2B2B2B"/>
                 <w:sz w:val="20"/>
               </w:rPr>
-              <w:t>Con quién se probó (solo el rol, no el nombre), qué tareas intentó, qué falló y qué se arregló.</w:t>
+              <w:t>Positivos con indicador y negativos con su mitigación.</w:t>
             </w:r>
           </w:p>
         </w:tc>
@@ -1041,7 +830,7 @@
                 <w:color w:val="2B2B2B"/>
                 <w:sz w:val="20"/>
               </w:rPr>
-              <w:t>Impacto</w:t>
+              <w:t>Limitaciones y siguiente paso</w:t>
             </w:r>
           </w:p>
         </w:tc>
@@ -1058,7 +847,7 @@
                 <w:color w:val="2B2B2B"/>
                 <w:sz w:val="20"/>
               </w:rPr>
-              <w:t>Positivos con indicador y negativos con su mitigación.</w:t>
+              <w:t>Lo que se decidió no hacer, con el motivo, y por dónde seguiría.</w:t>
             </w:r>
           </w:p>
         </w:tc>
@@ -1096,7 +885,7 @@
                 <w:color w:val="2B2B2B"/>
                 <w:sz w:val="20"/>
               </w:rPr>
-              <w:t>Limitaciones y siguiente paso</w:t>
+              <w:t>Declaración del uso de IA</w:t>
             </w:r>
           </w:p>
         </w:tc>
@@ -1114,7 +903,7 @@
                 <w:color w:val="2B2B2B"/>
                 <w:sz w:val="20"/>
               </w:rPr>
-              <w:t>Lo que se decidió no hacer, con el motivo, y por dónde seguiría.</w:t>
+              <w:t>Qué se le pidió (Clases 3 y 11), qué se corrigió a mano y qué no se le entregó.</w:t>
             </w:r>
           </w:p>
         </w:tc>
@@ -1150,61 +939,6 @@
                 <w:color w:val="2B2B2B"/>
                 <w:sz w:val="20"/>
               </w:rPr>
-              <w:t>Declaración del uso de IA</w:t>
-            </w:r>
-          </w:p>
-        </w:tc>
-        <w:tc>
-          <w:tcPr>
-            <w:tcW w:type="dxa" w:w="6624"/>
-          </w:tcPr>
-          <w:p>
-            <w:r/>
-            <w:r>
-              <w:rPr>
-                <w:rFonts w:ascii="Calibri" w:hAnsi="Calibri" w:eastAsia="Calibri"/>
-                <w:b w:val="0"/>
-                <w:color w:val="2B2B2B"/>
-                <w:sz w:val="20"/>
-              </w:rPr>
-              <w:t>Qué se le pidió (Clases 3 y 11), qué se corrigió a mano y qué no se le entregó.</w:t>
-            </w:r>
-          </w:p>
-        </w:tc>
-      </w:tr>
-      <w:tr>
-        <w:tc>
-          <w:tcPr>
-            <w:tcW w:type="dxa" w:w="576"/>
-            <w:shd w:val="clear" w:fill="F2F2F2"/>
-          </w:tcPr>
-          <w:p>
-            <w:r/>
-            <w:r>
-              <w:rPr>
-                <w:rFonts w:ascii="Calibri" w:hAnsi="Calibri" w:eastAsia="Calibri"/>
-                <w:b w:val="0"/>
-                <w:color w:val="2B2B2B"/>
-                <w:sz w:val="20"/>
-              </w:rPr>
-              <w:t>12</w:t>
-            </w:r>
-          </w:p>
-        </w:tc>
-        <w:tc>
-          <w:tcPr>
-            <w:tcW w:type="dxa" w:w="2592"/>
-            <w:shd w:val="clear" w:fill="F2F2F2"/>
-          </w:tcPr>
-          <w:p>
-            <w:r/>
-            <w:r>
-              <w:rPr>
-                <w:rFonts w:ascii="Calibri" w:hAnsi="Calibri" w:eastAsia="Calibri"/>
-                <w:b w:val="0"/>
-                <w:color w:val="2B2B2B"/>
-                <w:sz w:val="20"/>
-              </w:rPr>
               <w:t>Referencias</w:t>
             </w:r>
           </w:p>
@@ -1212,7 +946,6 @@
         <w:tc>
           <w:tcPr>
             <w:tcW w:type="dxa" w:w="6624"/>
-            <w:shd w:val="clear" w:fill="F2F2F2"/>
           </w:tcPr>
           <w:p>
             <w:r/>
@@ -1271,7 +1004,7 @@
           <w:color w:val="2B2B2B"/>
           <w:sz w:val="22"/>
         </w:rPr>
-        <w:t xml:space="preserve"> las 12 secciones completas y coherentes entre sí.</w:t>
+        <w:t xml:space="preserve"> las 11 secciones completas y coherentes entre sí.</w:t>
       </w:r>
     </w:p>
     <w:p>
@@ -1489,7 +1222,7 @@
                 <w:color w:val="2B2B2B"/>
                 <w:sz w:val="20"/>
               </w:rPr>
-              <w:t>3 · La solución y el prototipo en vivo</w:t>
+              <w:t>3 · La solución propuesta</w:t>
             </w:r>
           </w:p>
         </w:tc>
@@ -1506,7 +1239,7 @@
                 <w:color w:val="2B2B2B"/>
                 <w:sz w:val="20"/>
               </w:rPr>
-              <w:t>Recorren el prototipo navegable cumpliendo una tarea de principio a fin.</w:t>
+              <w:t>Qué se propone y cómo la usaría una persona, paso a paso.</w:t>
             </w:r>
           </w:p>
         </w:tc>
@@ -1543,7 +1276,7 @@
                 <w:color w:val="2B2B2B"/>
                 <w:sz w:val="20"/>
               </w:rPr>
-              <w:t>4 · Lo que falló y lo que aprendimos</w:t>
+              <w:t>4 · Lo que no resuelve</w:t>
             </w:r>
           </w:p>
         </w:tc>
@@ -1561,7 +1294,7 @@
                 <w:color w:val="2B2B2B"/>
                 <w:sz w:val="20"/>
               </w:rPr>
-              <w:t>Qué falló en la prueba, qué se arregló y qué no.</w:t>
+              <w:t>Las limitaciones: qué se decidió no hacer y por qué.</w:t>
             </w:r>
           </w:p>
         </w:tc>
@@ -1704,7 +1437,7 @@
           <w:color w:val="2B2B2B"/>
           <w:sz w:val="22"/>
         </w:rPr>
-        <w:t xml:space="preserve"> solo el .zip, de máximo 50 MB. No se sube ningún enlace aparte: todo va dentro del .zip.</w:t>
+        <w:t xml:space="preserve"> solo el informe final, en .docx o .pdf, de máximo 50 MB. No se sube ningún enlace aparte.</w:t>
       </w:r>
     </w:p>
     <w:p>
@@ -1776,7 +1509,7 @@
           <w:color w:val="2B2B2B"/>
           <w:sz w:val="22"/>
         </w:rPr>
-        <w:t xml:space="preserve"> el prototipo navegable, recorriendo en vivo una tarea de principio a fin, como si funcionara.</w:t>
+        <w:t xml:space="preserve"> lo que dice el informe, en el orden de los cinco tramos de la exposición.</w:t>
       </w:r>
     </w:p>
     <w:p>
@@ -1860,7 +1593,7 @@
           <w:color w:val="2B2B2B"/>
           <w:sz w:val="22"/>
         </w:rPr>
-        <w:t>Herramientas gratuitas y en el navegador: Google Drive, Excalidraw, draw.io y Google Slides. IA solo en las Clases 3 y 11, declarando qué se pidió y qué se corrigió; nunca con datos personales.</w:t>
+        <w:t>Herramientas gratuitas: Google Docs (en Google Drive) o Word para el informe. IA solo en las Clases 3 y 11, declarando qué se pidió y qué se corrigió; nunca con datos personales.</w:t>
       </w:r>
     </w:p>
     <w:sectPr>

</xml_diff>